<commit_message>
Links dos videos do pitch nas duas entregas
</commit_message>
<xml_diff>
--- a/docs/Protege_Mais_Fase5_Documento.docx
+++ b/docs/Protege_Mais_Fase5_Documento.docx
@@ -334,7 +334,7 @@
           <w:sz w:val="21"/>
           <w:color w:val="1565C0"/>
         </w:rPr>
-        <w:t>&lt;INSERIR LINK&gt;</w:t>
+        <w:t>https://youtu.be/DoenYynHA6E</w:t>
       </w:r>
     </w:p>
     <w:p>
@@ -695,7 +695,7 @@
               <w:rPr>
                 <w:rStyle w:val="VerbatimChar"/>
               </w:rPr>
-              <w:t xml:space="preserve">&lt;INSERIR LINK&gt;</w:t>
+              <w:t xml:space="preserve">https://youtu.be/DoenYynHA6E</w:t>
             </w:r>
             <w:r>
               <w:t xml:space="preserve">, replicado na apresentação e no site</w:t>

</xml_diff>